<commit_message>
refactor: change table and head styles
</commit_message>
<xml_diff>
--- a/examples/autosplit_example.docx
+++ b/examples/autosplit_example.docx
@@ -8528,6 +8528,7 @@
       <w:b/>
       <w:bCs/>
       <w:i w:val="0"/>
+      <w:caps/>
       <w:color w:val="000000"/>
       <w:sz w:val="28"/>
       <w:szCs w:val="28"/>
@@ -8555,6 +8556,7 @@
       <w:b/>
       <w:bCs/>
       <w:i w:val="0"/>
+      <w:caps w:val="0"/>
       <w:color w:val="000000"/>
       <w:sz w:val="28"/>
       <w:szCs w:val="26"/>
@@ -8582,6 +8584,7 @@
       <w:b/>
       <w:bCs/>
       <w:i w:val="0"/>
+      <w:caps w:val="0"/>
       <w:color w:val="000000"/>
       <w:sz w:val="28"/>
     </w:rPr>
@@ -8610,6 +8613,7 @@
       <w:bCs/>
       <w:i w:val="0"/>
       <w:iCs/>
+      <w:caps w:val="0"/>
       <w:color w:val="000000"/>
       <w:sz w:val="28"/>
     </w:rPr>
@@ -20163,7 +20167,7 @@
     <w:pPr>
       <w:spacing w:before="0" w:after="0"/>
       <w:ind w:firstLine="0"/>
-      <w:jc w:val="left"/>
+      <w:jc w:val="center"/>
     </w:pPr>
     <w:rPr>
       <w:rFonts w:ascii="Times New Roman" w:hAnsi="Times New Roman"/>

</xml_diff>

<commit_message>
feat: separate the table head from the body with a double line
Applied to the last head row, whichever it is: the column-number row, or the
column names when numbering is off. Repeats on every part of a split table.

python-docx does not register w:tcBorders, and w:tcPr child order is fixed by the
schema, so appending would put it after the w:vAlign we already set and Word
would reject the file. Inserted before its schema successors instead.

Co-Authored-By: Claude Opus 4.8 <noreply@anthropic.com>
</commit_message>
<xml_diff>
--- a/examples/autosplit_example.docx
+++ b/examples/autosplit_example.docx
@@ -123,6 +123,9 @@
         <w:tc>
           <w:tcPr>
             <w:tcW w:type="dxa" w:w="680"/>
+            <w:tcBorders>
+              <w:bottom w:val="double" w:sz="4" w:space="0" w:color="auto"/>
+            </w:tcBorders>
             <w:vAlign w:val="center"/>
           </w:tcPr>
           <w:p>
@@ -138,6 +141,9 @@
         <w:tc>
           <w:tcPr>
             <w:tcW w:type="dxa" w:w="2252"/>
+            <w:tcBorders>
+              <w:bottom w:val="double" w:sz="4" w:space="0" w:color="auto"/>
+            </w:tcBorders>
             <w:vAlign w:val="center"/>
           </w:tcPr>
           <w:p>
@@ -153,6 +159,9 @@
         <w:tc>
           <w:tcPr>
             <w:tcW w:type="dxa" w:w="2252"/>
+            <w:tcBorders>
+              <w:bottom w:val="double" w:sz="4" w:space="0" w:color="auto"/>
+            </w:tcBorders>
             <w:vAlign w:val="center"/>
           </w:tcPr>
           <w:p>
@@ -168,6 +177,9 @@
         <w:tc>
           <w:tcPr>
             <w:tcW w:type="dxa" w:w="2252"/>
+            <w:tcBorders>
+              <w:bottom w:val="double" w:sz="4" w:space="0" w:color="auto"/>
+            </w:tcBorders>
             <w:vAlign w:val="center"/>
           </w:tcPr>
           <w:p>
@@ -183,6 +195,9 @@
         <w:tc>
           <w:tcPr>
             <w:tcW w:type="dxa" w:w="2252"/>
+            <w:tcBorders>
+              <w:bottom w:val="double" w:sz="4" w:space="0" w:color="auto"/>
+            </w:tcBorders>
             <w:vAlign w:val="center"/>
           </w:tcPr>
           <w:p>
@@ -2639,6 +2654,9 @@
         <w:tc>
           <w:tcPr>
             <w:tcW w:type="dxa" w:w="680"/>
+            <w:tcBorders>
+              <w:bottom w:val="double" w:sz="4" w:space="0" w:color="auto"/>
+            </w:tcBorders>
             <w:vAlign w:val="center"/>
           </w:tcPr>
           <w:p>
@@ -2654,6 +2672,9 @@
         <w:tc>
           <w:tcPr>
             <w:tcW w:type="dxa" w:w="2252"/>
+            <w:tcBorders>
+              <w:bottom w:val="double" w:sz="4" w:space="0" w:color="auto"/>
+            </w:tcBorders>
             <w:vAlign w:val="center"/>
           </w:tcPr>
           <w:p>
@@ -2669,6 +2690,9 @@
         <w:tc>
           <w:tcPr>
             <w:tcW w:type="dxa" w:w="2252"/>
+            <w:tcBorders>
+              <w:bottom w:val="double" w:sz="4" w:space="0" w:color="auto"/>
+            </w:tcBorders>
             <w:vAlign w:val="center"/>
           </w:tcPr>
           <w:p>
@@ -2684,6 +2708,9 @@
         <w:tc>
           <w:tcPr>
             <w:tcW w:type="dxa" w:w="2252"/>
+            <w:tcBorders>
+              <w:bottom w:val="double" w:sz="4" w:space="0" w:color="auto"/>
+            </w:tcBorders>
             <w:vAlign w:val="center"/>
           </w:tcPr>
           <w:p>
@@ -2699,6 +2726,9 @@
         <w:tc>
           <w:tcPr>
             <w:tcW w:type="dxa" w:w="2252"/>
+            <w:tcBorders>
+              <w:bottom w:val="double" w:sz="4" w:space="0" w:color="auto"/>
+            </w:tcBorders>
             <w:vAlign w:val="center"/>
           </w:tcPr>
           <w:p>
@@ -5980,6 +6010,9 @@
         <w:tc>
           <w:tcPr>
             <w:tcW w:type="dxa" w:w="680"/>
+            <w:tcBorders>
+              <w:bottom w:val="double" w:sz="4" w:space="0" w:color="auto"/>
+            </w:tcBorders>
             <w:vAlign w:val="center"/>
           </w:tcPr>
           <w:p>
@@ -5995,6 +6028,9 @@
         <w:tc>
           <w:tcPr>
             <w:tcW w:type="dxa" w:w="2252"/>
+            <w:tcBorders>
+              <w:bottom w:val="double" w:sz="4" w:space="0" w:color="auto"/>
+            </w:tcBorders>
             <w:vAlign w:val="center"/>
           </w:tcPr>
           <w:p>
@@ -6010,6 +6046,9 @@
         <w:tc>
           <w:tcPr>
             <w:tcW w:type="dxa" w:w="2252"/>
+            <w:tcBorders>
+              <w:bottom w:val="double" w:sz="4" w:space="0" w:color="auto"/>
+            </w:tcBorders>
             <w:vAlign w:val="center"/>
           </w:tcPr>
           <w:p>
@@ -6025,6 +6064,9 @@
         <w:tc>
           <w:tcPr>
             <w:tcW w:type="dxa" w:w="2252"/>
+            <w:tcBorders>
+              <w:bottom w:val="double" w:sz="4" w:space="0" w:color="auto"/>
+            </w:tcBorders>
             <w:vAlign w:val="center"/>
           </w:tcPr>
           <w:p>
@@ -6040,6 +6082,9 @@
         <w:tc>
           <w:tcPr>
             <w:tcW w:type="dxa" w:w="2252"/>
+            <w:tcBorders>
+              <w:bottom w:val="double" w:sz="4" w:space="0" w:color="auto"/>
+            </w:tcBorders>
             <w:vAlign w:val="center"/>
           </w:tcPr>
           <w:p>

</xml_diff>

<commit_message>
fix: scale the pass limit with the work, not a flat 200
One split is placed per pass, so a document needing more than 200 splits aborted
with "Не удалось подобрать точки разрыва" on perfectly good layout -- 100 tables
splitting four ways each is 400. The limit only guards against a runaway loop, so
derive it from the real ceiling: a table cannot split more times than it has body
rows.

Co-Authored-By: Claude Opus 4.8 <noreply@anthropic.com>
</commit_message>
<xml_diff>
--- a/examples/autosplit_example.docx
+++ b/examples/autosplit_example.docx
@@ -9342,7 +9342,7 @@
       <w:keepLines/>
       <w:spacing w:before="0" w:after="0" w:line="360" w:lineRule="auto"/>
       <w:ind w:firstLine="709"/>
-      <w:jc w:val="left"/>
+      <w:jc w:val="both"/>
       <w:outlineLvl w:val="1"/>
     </w:pPr>
     <w:rPr>
@@ -9370,7 +9370,7 @@
       <w:keepLines/>
       <w:spacing w:before="0" w:after="0" w:line="360" w:lineRule="auto"/>
       <w:ind w:firstLine="709"/>
-      <w:jc w:val="left"/>
+      <w:jc w:val="both"/>
       <w:outlineLvl w:val="2"/>
     </w:pPr>
     <w:rPr>
@@ -9398,12 +9398,12 @@
       <w:keepLines/>
       <w:spacing w:before="0" w:after="0" w:line="360" w:lineRule="auto"/>
       <w:ind w:firstLine="709"/>
-      <w:jc w:val="left"/>
+      <w:jc w:val="both"/>
       <w:outlineLvl w:val="3"/>
     </w:pPr>
     <w:rPr>
       <w:rFonts w:ascii="Times New Roman" w:hAnsi="Times New Roman"/>
-      <w:b/>
+      <w:b w:val="0"/>
       <w:bCs/>
       <w:i w:val="0"/>
       <w:iCs/>
@@ -9425,12 +9425,18 @@
     <w:pPr>
       <w:keepNext/>
       <w:keepLines/>
-      <w:spacing w:before="200" w:after="0"/>
+      <w:spacing w:before="0" w:after="0" w:line="360" w:lineRule="auto"/>
+      <w:ind w:firstLine="709"/>
+      <w:jc w:val="both"/>
       <w:outlineLvl w:val="4"/>
     </w:pPr>
     <w:rPr>
-      <w:rFonts w:asciiTheme="majorHAnsi" w:eastAsiaTheme="majorEastAsia" w:hAnsiTheme="majorHAnsi" w:cstheme="majorBidi"/>
-      <w:color w:val="243F60" w:themeColor="accent1" w:themeShade="7F"/>
+      <w:rFonts w:ascii="Times New Roman" w:hAnsi="Times New Roman"/>
+      <w:b w:val="0"/>
+      <w:i w:val="0"/>
+      <w:caps w:val="0"/>
+      <w:color w:val="000000"/>
+      <w:sz w:val="28"/>
     </w:rPr>
   </w:style>
   <w:style w:type="paragraph" w:styleId="Heading6">

</xml_diff>